<commit_message>
Update daily stock monitor reports
</commit_message>
<xml_diff>
--- a/data/BOLL/美股BOLL布林线监控报告-2026-09-14.docx
+++ b/data/BOLL/美股BOLL布林线监控报告-2026-09-14.docx
@@ -15,7 +15,7 @@
         <w:pStyle w:val="ListBullet"/>
       </w:pPr>
       <w:r>
-        <w:t>生成时间（美东）：2026-09-14 21:33:18 EDT</w:t>
+        <w:t>生成时间（美东）：2026-09-14 22:20:59 EDT</w:t>
       </w:r>
     </w:p>
     <w:p>
@@ -224,7 +224,7 @@
           </w:tcPr>
           <w:p>
             <w:r>
-              <w:t>22.79%</w:t>
+              <w:t>26.65%</w:t>
             </w:r>
           </w:p>
         </w:tc>
@@ -234,7 +234,7 @@
           </w:tcPr>
           <w:p>
             <w:r>
-              <w:t>1.253</w:t>
+              <w:t>1.162</w:t>
             </w:r>
           </w:p>
         </w:tc>
@@ -244,7 +244,7 @@
           </w:tcPr>
           <w:p>
             <w:r>
-              <w:t>2.39</w:t>
+              <w:t>1.88</w:t>
             </w:r>
           </w:p>
         </w:tc>
@@ -266,7 +266,7 @@
           </w:tcPr>
           <w:p>
             <w:r>
-              <w:t>DELL</w:t>
+              <w:t>GOOG</w:t>
             </w:r>
           </w:p>
         </w:tc>
@@ -276,7 +276,7 @@
           </w:tcPr>
           <w:p>
             <w:r>
-              <w:t>Dell Technologies</w:t>
+              <w:t>Alphabet Inc.</w:t>
             </w:r>
           </w:p>
         </w:tc>
@@ -296,7 +296,7 @@
           </w:tcPr>
           <w:p>
             <w:r>
-              <w:t>布林带向上开口（最近5天）；成交量放大；放量突破上轨-中</w:t>
+              <w:t>中轨反弹并接近上轨；成交量放大；下轨反弹：处于中轨与上轨之间；成交量温和改善</w:t>
             </w:r>
           </w:p>
         </w:tc>
@@ -306,7 +306,7 @@
           </w:tcPr>
           <w:p>
             <w:r>
-              <w:t>突破上轨</w:t>
+              <w:t>靠近上轨</w:t>
             </w:r>
           </w:p>
         </w:tc>
@@ -316,7 +316,7 @@
           </w:tcPr>
           <w:p>
             <w:r>
-              <w:t>32.70%</w:t>
+              <w:t>5.54%</w:t>
             </w:r>
           </w:p>
         </w:tc>
@@ -326,7 +326,7 @@
           </w:tcPr>
           <w:p>
             <w:r>
-              <w:t>1.061</w:t>
+              <w:t>0.904</w:t>
             </w:r>
           </w:p>
         </w:tc>
@@ -336,7 +336,7 @@
           </w:tcPr>
           <w:p>
             <w:r>
-              <w:t>1.64</w:t>
+              <w:t>1.41</w:t>
             </w:r>
           </w:p>
         </w:tc>
@@ -346,7 +346,7 @@
           </w:tcPr>
           <w:p>
             <w:r>
-              <w:t>股价放量突破布林线上轨，说明短线多头动能较强，可能进入强势上涨阶段，但也要注意短线过热和回</w:t>
+              <w:t>股价从中轨附近反弹并接近上轨，且成交量放大，说明短线修复增强；若后续能维持中轨支撑并突破上</w:t>
             </w:r>
           </w:p>
         </w:tc>
@@ -358,7 +358,7 @@
           </w:tcPr>
           <w:p>
             <w:r>
-              <w:t>NOK</w:t>
+              <w:t>ORCL</w:t>
             </w:r>
           </w:p>
         </w:tc>
@@ -368,191 +368,7 @@
           </w:tcPr>
           <w:p>
             <w:r>
-              <w:t>Nokia Oyj</w:t>
-            </w:r>
-          </w:p>
-        </w:tc>
-        <w:tc>
-          <w:tcPr>
-            <w:tcW w:type="dxa" w:w="960"/>
-          </w:tcPr>
-          <w:p>
-            <w:r>
-              <w:t>C 观察信号</w:t>
-            </w:r>
-          </w:p>
-        </w:tc>
-        <w:tc>
-          <w:tcPr>
-            <w:tcW w:type="dxa" w:w="960"/>
-          </w:tcPr>
-          <w:p>
-            <w:r>
-              <w:t>突破上轨但量能不足-弱</w:t>
-            </w:r>
-          </w:p>
-        </w:tc>
-        <w:tc>
-          <w:tcPr>
-            <w:tcW w:type="dxa" w:w="960"/>
-          </w:tcPr>
-          <w:p>
-            <w:r>
-              <w:t>突破上轨</w:t>
-            </w:r>
-          </w:p>
-        </w:tc>
-        <w:tc>
-          <w:tcPr>
-            <w:tcW w:type="dxa" w:w="960"/>
-          </w:tcPr>
-          <w:p>
-            <w:r>
-              <w:t>13.82%</w:t>
-            </w:r>
-          </w:p>
-        </w:tc>
-        <w:tc>
-          <w:tcPr>
-            <w:tcW w:type="dxa" w:w="960"/>
-          </w:tcPr>
-          <w:p>
-            <w:r>
-              <w:t>1.052</w:t>
-            </w:r>
-          </w:p>
-        </w:tc>
-        <w:tc>
-          <w:tcPr>
-            <w:tcW w:type="dxa" w:w="960"/>
-          </w:tcPr>
-          <w:p>
-            <w:r>
-              <w:t>1.26</w:t>
-            </w:r>
-          </w:p>
-        </w:tc>
-        <w:tc>
-          <w:tcPr>
-            <w:tcW w:type="dxa" w:w="960"/>
-          </w:tcPr>
-          <w:p>
-            <w:r>
-              <w:t>股价突破布林线上轨，但成交量确认不足，可能是假突破，需要下一交易日确认。</w:t>
-            </w:r>
-          </w:p>
-        </w:tc>
-      </w:tr>
-      <w:tr>
-        <w:tc>
-          <w:tcPr>
-            <w:tcW w:type="dxa" w:w="960"/>
-          </w:tcPr>
-          <w:p>
-            <w:r>
-              <w:t>QCOM</w:t>
-            </w:r>
-          </w:p>
-        </w:tc>
-        <w:tc>
-          <w:tcPr>
-            <w:tcW w:type="dxa" w:w="960"/>
-          </w:tcPr>
-          <w:p>
-            <w:r>
-              <w:t>QUALCOMM Incorporated</w:t>
-            </w:r>
-          </w:p>
-        </w:tc>
-        <w:tc>
-          <w:tcPr>
-            <w:tcW w:type="dxa" w:w="960"/>
-          </w:tcPr>
-          <w:p>
-            <w:r>
-              <w:t>C 观察信号</w:t>
-            </w:r>
-          </w:p>
-        </w:tc>
-        <w:tc>
-          <w:tcPr>
-            <w:tcW w:type="dxa" w:w="960"/>
-          </w:tcPr>
-          <w:p>
-            <w:r>
-              <w:t>突破上轨但量能不足-弱；连续2日站上上轨</w:t>
-            </w:r>
-          </w:p>
-        </w:tc>
-        <w:tc>
-          <w:tcPr>
-            <w:tcW w:type="dxa" w:w="960"/>
-          </w:tcPr>
-          <w:p>
-            <w:r>
-              <w:t>突破上轨</w:t>
-            </w:r>
-          </w:p>
-        </w:tc>
-        <w:tc>
-          <w:tcPr>
-            <w:tcW w:type="dxa" w:w="960"/>
-          </w:tcPr>
-          <w:p>
-            <w:r>
-              <w:t>15.15%</w:t>
-            </w:r>
-          </w:p>
-        </w:tc>
-        <w:tc>
-          <w:tcPr>
-            <w:tcW w:type="dxa" w:w="960"/>
-          </w:tcPr>
-          <w:p>
-            <w:r>
-              <w:t>1.098</w:t>
-            </w:r>
-          </w:p>
-        </w:tc>
-        <w:tc>
-          <w:tcPr>
-            <w:tcW w:type="dxa" w:w="960"/>
-          </w:tcPr>
-          <w:p>
-            <w:r>
-              <w:t>1.05</w:t>
-            </w:r>
-          </w:p>
-        </w:tc>
-        <w:tc>
-          <w:tcPr>
-            <w:tcW w:type="dxa" w:w="960"/>
-          </w:tcPr>
-          <w:p>
-            <w:r>
-              <w:t>股价突破布林线上轨，但成交量确认不足，可能是假突破，需要下一交易日确认。</w:t>
-            </w:r>
-          </w:p>
-        </w:tc>
-      </w:tr>
-      <w:tr>
-        <w:tc>
-          <w:tcPr>
-            <w:tcW w:type="dxa" w:w="960"/>
-          </w:tcPr>
-          <w:p>
-            <w:r>
-              <w:t>POET</w:t>
-            </w:r>
-          </w:p>
-        </w:tc>
-        <w:tc>
-          <w:tcPr>
-            <w:tcW w:type="dxa" w:w="960"/>
-          </w:tcPr>
-          <w:p>
-            <w:r>
-              <w:t>POET Technologies</w:t>
+              <w:t>Oracle</w:t>
             </w:r>
           </w:p>
         </w:tc>
@@ -592,7 +408,7 @@
           </w:tcPr>
           <w:p>
             <w:r>
-              <w:t>30.73%</w:t>
+              <w:t>16.60%</w:t>
             </w:r>
           </w:p>
         </w:tc>
@@ -602,7 +418,7 @@
           </w:tcPr>
           <w:p>
             <w:r>
-              <w:t>0.460</w:t>
+              <w:t>0.326</w:t>
             </w:r>
           </w:p>
         </w:tc>
@@ -612,7 +428,7 @@
           </w:tcPr>
           <w:p>
             <w:r>
-              <w:t>0.93</w:t>
+              <w:t>1.52</w:t>
             </w:r>
           </w:p>
         </w:tc>
@@ -634,7 +450,7 @@
           </w:tcPr>
           <w:p>
             <w:r>
-              <w:t>AVGO</w:t>
+              <w:t>NBIS</w:t>
             </w:r>
           </w:p>
         </w:tc>
@@ -644,375 +460,7 @@
           </w:tcPr>
           <w:p>
             <w:r>
-              <w:t>Broadcom Inc.</w:t>
-            </w:r>
-          </w:p>
-        </w:tc>
-        <w:tc>
-          <w:tcPr>
-            <w:tcW w:type="dxa" w:w="960"/>
-          </w:tcPr>
-          <w:p>
-            <w:r>
-              <w:t>C 观察信号</w:t>
-            </w:r>
-          </w:p>
-        </w:tc>
-        <w:tc>
-          <w:tcPr>
-            <w:tcW w:type="dxa" w:w="960"/>
-          </w:tcPr>
-          <w:p>
-            <w:r>
-              <w:t>弱收口：Bandwidth低于近8个月30%分位且最近8个交易日及以上连续下降；中轨附近窄幅震荡</w:t>
-            </w:r>
-          </w:p>
-        </w:tc>
-        <w:tc>
-          <w:tcPr>
-            <w:tcW w:type="dxa" w:w="960"/>
-          </w:tcPr>
-          <w:p>
-            <w:r>
-              <w:t>中轨附近</w:t>
-            </w:r>
-          </w:p>
-        </w:tc>
-        <w:tc>
-          <w:tcPr>
-            <w:tcW w:type="dxa" w:w="960"/>
-          </w:tcPr>
-          <w:p>
-            <w:r>
-              <w:t>11.19%</w:t>
-            </w:r>
-          </w:p>
-        </w:tc>
-        <w:tc>
-          <w:tcPr>
-            <w:tcW w:type="dxa" w:w="960"/>
-          </w:tcPr>
-          <w:p>
-            <w:r>
-              <w:t>0.366</w:t>
-            </w:r>
-          </w:p>
-        </w:tc>
-        <w:tc>
-          <w:tcPr>
-            <w:tcW w:type="dxa" w:w="960"/>
-          </w:tcPr>
-          <w:p>
-            <w:r>
-              <w:t>0.82</w:t>
-            </w:r>
-          </w:p>
-        </w:tc>
-        <w:tc>
-          <w:tcPr>
-            <w:tcW w:type="dxa" w:w="960"/>
-          </w:tcPr>
-          <w:p>
-            <w:r>
-              <w:t>布林带收口，说明波动率下降，股价可能处于蓄势阶段，但方向尚未确认。</w:t>
-            </w:r>
-          </w:p>
-        </w:tc>
-      </w:tr>
-      <w:tr>
-        <w:tc>
-          <w:tcPr>
-            <w:tcW w:type="dxa" w:w="960"/>
-          </w:tcPr>
-          <w:p>
-            <w:r>
-              <w:t>CORZ</w:t>
-            </w:r>
-          </w:p>
-        </w:tc>
-        <w:tc>
-          <w:tcPr>
-            <w:tcW w:type="dxa" w:w="960"/>
-          </w:tcPr>
-          <w:p>
-            <w:r>
-              <w:t>Core Scientific, Inc.</w:t>
-            </w:r>
-          </w:p>
-        </w:tc>
-        <w:tc>
-          <w:tcPr>
-            <w:tcW w:type="dxa" w:w="960"/>
-          </w:tcPr>
-          <w:p>
-            <w:r>
-              <w:t>C 观察信号</w:t>
-            </w:r>
-          </w:p>
-        </w:tc>
-        <w:tc>
-          <w:tcPr>
-            <w:tcW w:type="dxa" w:w="960"/>
-          </w:tcPr>
-          <w:p>
-            <w:r>
-              <w:t>弱收口：Bandwidth低于近8个月30%分位且最近8个交易日及以上连续下降；中轨附近窄幅震荡；低位形态</w:t>
-            </w:r>
-          </w:p>
-        </w:tc>
-        <w:tc>
-          <w:tcPr>
-            <w:tcW w:type="dxa" w:w="960"/>
-          </w:tcPr>
-          <w:p>
-            <w:r>
-              <w:t>中轨附近</w:t>
-            </w:r>
-          </w:p>
-        </w:tc>
-        <w:tc>
-          <w:tcPr>
-            <w:tcW w:type="dxa" w:w="960"/>
-          </w:tcPr>
-          <w:p>
-            <w:r>
-              <w:t>23.83%</w:t>
-            </w:r>
-          </w:p>
-        </w:tc>
-        <w:tc>
-          <w:tcPr>
-            <w:tcW w:type="dxa" w:w="960"/>
-          </w:tcPr>
-          <w:p>
-            <w:r>
-              <w:t>0.509</w:t>
-            </w:r>
-          </w:p>
-        </w:tc>
-        <w:tc>
-          <w:tcPr>
-            <w:tcW w:type="dxa" w:w="960"/>
-          </w:tcPr>
-          <w:p>
-            <w:r>
-              <w:t>0.81</w:t>
-            </w:r>
-          </w:p>
-        </w:tc>
-        <w:tc>
-          <w:tcPr>
-            <w:tcW w:type="dxa" w:w="960"/>
-          </w:tcPr>
-          <w:p>
-            <w:r>
-              <w:t>布林带收口，说明波动率下降，股价可能处于蓄势阶段，但方向尚未确认。</w:t>
-            </w:r>
-          </w:p>
-        </w:tc>
-      </w:tr>
-      <w:tr>
-        <w:tc>
-          <w:tcPr>
-            <w:tcW w:type="dxa" w:w="960"/>
-          </w:tcPr>
-          <w:p>
-            <w:r>
-              <w:t>MSFT</w:t>
-            </w:r>
-          </w:p>
-        </w:tc>
-        <w:tc>
-          <w:tcPr>
-            <w:tcW w:type="dxa" w:w="960"/>
-          </w:tcPr>
-          <w:p>
-            <w:r>
-              <w:t>Microsoft Corporation</w:t>
-            </w:r>
-          </w:p>
-        </w:tc>
-        <w:tc>
-          <w:tcPr>
-            <w:tcW w:type="dxa" w:w="960"/>
-          </w:tcPr>
-          <w:p>
-            <w:r>
-              <w:t>C 观察信号</w:t>
-            </w:r>
-          </w:p>
-        </w:tc>
-        <w:tc>
-          <w:tcPr>
-            <w:tcW w:type="dxa" w:w="960"/>
-          </w:tcPr>
-          <w:p>
-            <w:r>
-              <w:t>弱收口：Bandwidth连续11天维持低于近8个月30%分位；中轨附近窄幅震荡</w:t>
-            </w:r>
-          </w:p>
-        </w:tc>
-        <w:tc>
-          <w:tcPr>
-            <w:tcW w:type="dxa" w:w="960"/>
-          </w:tcPr>
-          <w:p>
-            <w:r>
-              <w:t>中轨附近</w:t>
-            </w:r>
-          </w:p>
-        </w:tc>
-        <w:tc>
-          <w:tcPr>
-            <w:tcW w:type="dxa" w:w="960"/>
-          </w:tcPr>
-          <w:p>
-            <w:r>
-              <w:t>7.69%</w:t>
-            </w:r>
-          </w:p>
-        </w:tc>
-        <w:tc>
-          <w:tcPr>
-            <w:tcW w:type="dxa" w:w="960"/>
-          </w:tcPr>
-          <w:p>
-            <w:r>
-              <w:t>0.531</w:t>
-            </w:r>
-          </w:p>
-        </w:tc>
-        <w:tc>
-          <w:tcPr>
-            <w:tcW w:type="dxa" w:w="960"/>
-          </w:tcPr>
-          <w:p>
-            <w:r>
-              <w:t>0.70</w:t>
-            </w:r>
-          </w:p>
-        </w:tc>
-        <w:tc>
-          <w:tcPr>
-            <w:tcW w:type="dxa" w:w="960"/>
-          </w:tcPr>
-          <w:p>
-            <w:r>
-              <w:t>布林带收口，说明波动率下降，股价可能处于蓄势阶段，但方向尚未确认。</w:t>
-            </w:r>
-          </w:p>
-        </w:tc>
-      </w:tr>
-      <w:tr>
-        <w:tc>
-          <w:tcPr>
-            <w:tcW w:type="dxa" w:w="960"/>
-          </w:tcPr>
-          <w:p>
-            <w:r>
-              <w:t>NVDA</w:t>
-            </w:r>
-          </w:p>
-        </w:tc>
-        <w:tc>
-          <w:tcPr>
-            <w:tcW w:type="dxa" w:w="960"/>
-          </w:tcPr>
-          <w:p>
-            <w:r>
-              <w:t>NVIDIA</w:t>
-            </w:r>
-          </w:p>
-        </w:tc>
-        <w:tc>
-          <w:tcPr>
-            <w:tcW w:type="dxa" w:w="960"/>
-          </w:tcPr>
-          <w:p>
-            <w:r>
-              <w:t>C 观察信号</w:t>
-            </w:r>
-          </w:p>
-        </w:tc>
-        <w:tc>
-          <w:tcPr>
-            <w:tcW w:type="dxa" w:w="960"/>
-          </w:tcPr>
-          <w:p>
-            <w:r>
-              <w:t>弱收口：Bandwidth连续10天维持低于近8个月30%分位；中轨附近窄幅震荡</w:t>
-            </w:r>
-          </w:p>
-        </w:tc>
-        <w:tc>
-          <w:tcPr>
-            <w:tcW w:type="dxa" w:w="960"/>
-          </w:tcPr>
-          <w:p>
-            <w:r>
-              <w:t>中轨附近</w:t>
-            </w:r>
-          </w:p>
-        </w:tc>
-        <w:tc>
-          <w:tcPr>
-            <w:tcW w:type="dxa" w:w="960"/>
-          </w:tcPr>
-          <w:p>
-            <w:r>
-              <w:t>10.82%</w:t>
-            </w:r>
-          </w:p>
-        </w:tc>
-        <w:tc>
-          <w:tcPr>
-            <w:tcW w:type="dxa" w:w="960"/>
-          </w:tcPr>
-          <w:p>
-            <w:r>
-              <w:t>0.421</w:t>
-            </w:r>
-          </w:p>
-        </w:tc>
-        <w:tc>
-          <w:tcPr>
-            <w:tcW w:type="dxa" w:w="960"/>
-          </w:tcPr>
-          <w:p>
-            <w:r>
-              <w:t>0.70</w:t>
-            </w:r>
-          </w:p>
-        </w:tc>
-        <w:tc>
-          <w:tcPr>
-            <w:tcW w:type="dxa" w:w="960"/>
-          </w:tcPr>
-          <w:p>
-            <w:r>
-              <w:t>布林带收口，说明波动率下降，股价可能处于蓄势阶段，但方向尚未确认。</w:t>
-            </w:r>
-          </w:p>
-        </w:tc>
-      </w:tr>
-      <w:tr>
-        <w:tc>
-          <w:tcPr>
-            <w:tcW w:type="dxa" w:w="960"/>
-          </w:tcPr>
-          <w:p>
-            <w:r>
-              <w:t>ALAB</w:t>
-            </w:r>
-          </w:p>
-        </w:tc>
-        <w:tc>
-          <w:tcPr>
-            <w:tcW w:type="dxa" w:w="960"/>
-          </w:tcPr>
-          <w:p>
-            <w:r>
-              <w:t>Astera Labs</w:t>
+              <w:t>Nebius Group</w:t>
             </w:r>
           </w:p>
         </w:tc>
@@ -1052,7 +500,7 @@
           </w:tcPr>
           <w:p>
             <w:r>
-              <w:t>17.63%</w:t>
+              <w:t>29.65%</w:t>
             </w:r>
           </w:p>
         </w:tc>
@@ -1062,7 +510,7 @@
           </w:tcPr>
           <w:p>
             <w:r>
-              <w:t>0.463</w:t>
+              <w:t>0.343</w:t>
             </w:r>
           </w:p>
         </w:tc>
@@ -1072,7 +520,99 @@
           </w:tcPr>
           <w:p>
             <w:r>
-              <w:t>0.68</w:t>
+              <w:t>0.79</w:t>
+            </w:r>
+          </w:p>
+        </w:tc>
+        <w:tc>
+          <w:tcPr>
+            <w:tcW w:type="dxa" w:w="960"/>
+          </w:tcPr>
+          <w:p>
+            <w:r>
+              <w:t>布林带收口，说明波动率下降，股价可能处于蓄势阶段，但方向尚未确认。</w:t>
+            </w:r>
+          </w:p>
+        </w:tc>
+      </w:tr>
+      <w:tr>
+        <w:tc>
+          <w:tcPr>
+            <w:tcW w:type="dxa" w:w="960"/>
+          </w:tcPr>
+          <w:p>
+            <w:r>
+              <w:t>ASTS</w:t>
+            </w:r>
+          </w:p>
+        </w:tc>
+        <w:tc>
+          <w:tcPr>
+            <w:tcW w:type="dxa" w:w="960"/>
+          </w:tcPr>
+          <w:p>
+            <w:r>
+              <w:t>AST SpaceMobile</w:t>
+            </w:r>
+          </w:p>
+        </w:tc>
+        <w:tc>
+          <w:tcPr>
+            <w:tcW w:type="dxa" w:w="960"/>
+          </w:tcPr>
+          <w:p>
+            <w:r>
+              <w:t>C 观察信号</w:t>
+            </w:r>
+          </w:p>
+        </w:tc>
+        <w:tc>
+          <w:tcPr>
+            <w:tcW w:type="dxa" w:w="960"/>
+          </w:tcPr>
+          <w:p>
+            <w:r>
+              <w:t>强收口：Bandwidth创近100日新低；中轨附近窄幅震荡；低位形态</w:t>
+            </w:r>
+          </w:p>
+        </w:tc>
+        <w:tc>
+          <w:tcPr>
+            <w:tcW w:type="dxa" w:w="960"/>
+          </w:tcPr>
+          <w:p>
+            <w:r>
+              <w:t>中轨附近</w:t>
+            </w:r>
+          </w:p>
+        </w:tc>
+        <w:tc>
+          <w:tcPr>
+            <w:tcW w:type="dxa" w:w="960"/>
+          </w:tcPr>
+          <w:p>
+            <w:r>
+              <w:t>23.60%</w:t>
+            </w:r>
+          </w:p>
+        </w:tc>
+        <w:tc>
+          <w:tcPr>
+            <w:tcW w:type="dxa" w:w="960"/>
+          </w:tcPr>
+          <w:p>
+            <w:r>
+              <w:t>0.324</w:t>
+            </w:r>
+          </w:p>
+        </w:tc>
+        <w:tc>
+          <w:tcPr>
+            <w:tcW w:type="dxa" w:w="960"/>
+          </w:tcPr>
+          <w:p>
+            <w:r>
+              <w:t>0.73</w:t>
             </w:r>
           </w:p>
         </w:tc>
@@ -1101,7 +641,7 @@
         <w:pStyle w:val="ListBullet"/>
       </w:pPr>
       <w:r>
-        <w:t>强信号：INSP, DELL。</w:t>
+        <w:t>强信号：INSP, GOOG。</w:t>
       </w:r>
     </w:p>
     <w:p>
@@ -1117,7 +657,7 @@
         <w:pStyle w:val="ListBullet"/>
       </w:pPr>
       <w:r>
-        <w:t>观察信号：NOK, QCOM, POET, AVGO, CORZ, MSFT, NVDA, ALAB。</w:t>
+        <w:t>观察信号：ORCL, NBIS, ASTS。</w:t>
       </w:r>
     </w:p>
     <w:p>
@@ -1125,7 +665,7 @@
         <w:pStyle w:val="ListBullet"/>
       </w:pPr>
       <w:r>
-        <w:t>今日优先复核：INSP, DELL, NOK, QCOM, POET。优先看是否放量、能否站稳上轨或中轨。</w:t>
+        <w:t>今日优先复核：INSP, GOOG, ORCL, NBIS, ASTS。优先看是否放量、能否站稳上轨或中轨。</w:t>
       </w:r>
     </w:p>
     <w:p>
@@ -1165,7 +705,7 @@
         <w:pStyle w:val="ListBullet"/>
       </w:pPr>
       <w:r>
-        <w:t>最新收盘价：$73.00</w:t>
+        <w:t>最新收盘价：$74.32</w:t>
       </w:r>
     </w:p>
     <w:p>
@@ -1173,7 +713,7 @@
         <w:pStyle w:val="ListBullet"/>
       </w:pPr>
       <w:r>
-        <w:t>BOLL：上轨 $69.41；中轨 $62.31；下轨 $55.21</w:t>
+        <w:t>BOLL：上轨 $71.59；中轨 $63.17；下轨 $54.75</w:t>
       </w:r>
     </w:p>
     <w:p>
@@ -1181,7 +721,7 @@
         <w:pStyle w:val="ListBullet"/>
       </w:pPr>
       <w:r>
-        <w:t>Bandwidth：22.79%；历史分位：47.02%；%B：1.253</w:t>
+        <w:t>Bandwidth：26.65%；历史分位：55.95%；%B：1.162</w:t>
       </w:r>
     </w:p>
     <w:p>
@@ -1189,7 +729,7 @@
         <w:pStyle w:val="ListBullet"/>
       </w:pPr>
       <w:r>
-        <w:t>成交量：当日 1399300；20日均量 585365；量比 2.39</w:t>
+        <w:t>成交量：当日 1172100；20日均量 624125；量比 1.88</w:t>
       </w:r>
     </w:p>
     <w:p>
@@ -1229,7 +769,7 @@
         <w:pStyle w:val="Heading3"/>
       </w:pPr>
       <w:r>
-        <w:t>DELL - Dell Technologies</w:t>
+        <w:t>GOOG - Alphabet Inc.</w:t>
       </w:r>
     </w:p>
     <w:p>
@@ -1245,7 +785,7 @@
         <w:pStyle w:val="ListBullet"/>
       </w:pPr>
       <w:r>
-        <w:t>最新收盘价：$567.29</w:t>
+        <w:t>最新收盘价：$345.71</w:t>
       </w:r>
     </w:p>
     <w:p>
@@ -1253,7 +793,7 @@
         <w:pStyle w:val="ListBullet"/>
       </w:pPr>
       <w:r>
-        <w:t>BOLL：上轨 $557.75；中轨 $479.37；下轨 $400.99</w:t>
+        <w:t>BOLL：上轨 $347.52；中轨 $338.15；下轨 $328.78</w:t>
       </w:r>
     </w:p>
     <w:p>
@@ -1261,7 +801,7 @@
         <w:pStyle w:val="ListBullet"/>
       </w:pPr>
       <w:r>
-        <w:t>Bandwidth：32.70%；历史分位：73.81%；%B：1.061</w:t>
+        <w:t>Bandwidth：5.54%；历史分位：5.95%；%B：0.904</w:t>
       </w:r>
     </w:p>
     <w:p>
@@ -1269,7 +809,7 @@
         <w:pStyle w:val="ListBullet"/>
       </w:pPr>
       <w:r>
-        <w:t>成交量：当日 14473500；20日均量 8831645；量比 1.64</w:t>
+        <w:t>成交量：当日 22441500；20日均量 15921845；量比 1.41</w:t>
       </w:r>
     </w:p>
     <w:p>
@@ -1277,7 +817,7 @@
         <w:pStyle w:val="ListBullet"/>
       </w:pPr>
       <w:r>
-        <w:t>触发信号：布林带向上开口（最近5天）；成交量放大；放量突破上轨-中</w:t>
+        <w:t>触发信号：中轨反弹并接近上轨；成交量放大；下轨反弹：处于中轨与上轨之间；成交量温和改善</w:t>
       </w:r>
     </w:p>
     <w:p>
@@ -1285,7 +825,7 @@
         <w:pStyle w:val="ListBullet"/>
       </w:pPr>
       <w:r>
-        <w:t>技术面解读：股价放量突破布林线上轨，说明短线多头动能较强，可能进入强势上涨阶段，但也要注意短线过热和回踩风险。</w:t>
+        <w:t>技术面解读：股价从中轨附近反弹并接近上轨，且成交量放大，说明短线修复增强；若后续能维持中轨支撑并突破上轨，形态有望继续改善。</w:t>
       </w:r>
     </w:p>
     <w:p>
@@ -1301,7 +841,7 @@
         <w:pStyle w:val="ListBullet"/>
       </w:pPr>
       <w:r>
-        <w:t>风险提示：尚未连续两日站上上轨，需要下一交易日确认。</w:t>
+        <w:t>风险提示：当前方向仍未完全确认，需要观察成交量和中轨支撑。</w:t>
       </w:r>
     </w:p>
     <w:p>
@@ -1309,7 +849,7 @@
         <w:pStyle w:val="Heading3"/>
       </w:pPr>
       <w:r>
-        <w:t>NOK - Nokia Oyj</w:t>
+        <w:t>ORCL - Oracle</w:t>
       </w:r>
     </w:p>
     <w:p>
@@ -1325,7 +865,7 @@
         <w:pStyle w:val="ListBullet"/>
       </w:pPr>
       <w:r>
-        <w:t>最新收盘价：$11.13</w:t>
+        <w:t>最新收盘价：$144.79</w:t>
       </w:r>
     </w:p>
     <w:p>
@@ -1333,7 +873,7 @@
         <w:pStyle w:val="ListBullet"/>
       </w:pPr>
       <w:r>
-        <w:t>BOLL：上轨 $11.05；中轨 $10.34；下轨 $9.63</w:t>
+        <w:t>BOLL：上轨 $161.47；中轨 $149.09；下轨 $136.71</w:t>
       </w:r>
     </w:p>
     <w:p>
@@ -1341,7 +881,7 @@
         <w:pStyle w:val="ListBullet"/>
       </w:pPr>
       <w:r>
-        <w:t>Bandwidth：13.82%；历史分位：17.26%；%B：1.052</w:t>
+        <w:t>Bandwidth：16.60%；历史分位：24.40%；%B：0.326</w:t>
       </w:r>
     </w:p>
     <w:p>
@@ -1349,167 +889,7 @@
         <w:pStyle w:val="ListBullet"/>
       </w:pPr>
       <w:r>
-        <w:t>成交量：当日 86733800；20日均量 69059875；量比 1.26</w:t>
-      </w:r>
-    </w:p>
-    <w:p>
-      <w:pPr>
-        <w:pStyle w:val="ListBullet"/>
-      </w:pPr>
-      <w:r>
-        <w:t>触发信号：突破上轨但量能不足-弱</w:t>
-      </w:r>
-    </w:p>
-    <w:p>
-      <w:pPr>
-        <w:pStyle w:val="ListBullet"/>
-      </w:pPr>
-      <w:r>
-        <w:t>技术面解读：股价突破布林线上轨，但成交量确认不足，可能是假突破，需要下一交易日确认。</w:t>
-      </w:r>
-    </w:p>
-    <w:p>
-      <w:pPr>
-        <w:pStyle w:val="ListBullet"/>
-      </w:pPr>
-      <w:r>
-        <w:t>是否需要下一交易日确认：是。重点观察收盘价是否继续位于关键轨道一侧，以及成交量是否延续。</w:t>
-      </w:r>
-    </w:p>
-    <w:p>
-      <w:pPr>
-        <w:pStyle w:val="ListBullet"/>
-      </w:pPr>
-      <w:r>
-        <w:t>风险提示：突破上轨但成交量不足，存在假突破风险。；尚未连续两日站上上轨，需要下一交易日确认。</w:t>
-      </w:r>
-    </w:p>
-    <w:p>
-      <w:pPr>
-        <w:pStyle w:val="Heading3"/>
-      </w:pPr>
-      <w:r>
-        <w:t>QCOM - QUALCOMM Incorporated</w:t>
-      </w:r>
-    </w:p>
-    <w:p>
-      <w:pPr>
-        <w:pStyle w:val="ListBullet"/>
-      </w:pPr>
-      <w:r>
-        <w:t>信号等级：C 观察信号</w:t>
-      </w:r>
-    </w:p>
-    <w:p>
-      <w:pPr>
-        <w:pStyle w:val="ListBullet"/>
-      </w:pPr>
-      <w:r>
-        <w:t>最新收盘价：$181.97</w:t>
-      </w:r>
-    </w:p>
-    <w:p>
-      <w:pPr>
-        <w:pStyle w:val="ListBullet"/>
-      </w:pPr>
-      <w:r>
-        <w:t>BOLL：上轨 $179.49；中轨 $166.85；下轨 $154.22</w:t>
-      </w:r>
-    </w:p>
-    <w:p>
-      <w:pPr>
-        <w:pStyle w:val="ListBullet"/>
-      </w:pPr>
-      <w:r>
-        <w:t>Bandwidth：15.15%；历史分位：34.52%；%B：1.098</w:t>
-      </w:r>
-    </w:p>
-    <w:p>
-      <w:pPr>
-        <w:pStyle w:val="ListBullet"/>
-      </w:pPr>
-      <w:r>
-        <w:t>成交量：当日 11546600；20日均量 10948215；量比 1.05</w:t>
-      </w:r>
-    </w:p>
-    <w:p>
-      <w:pPr>
-        <w:pStyle w:val="ListBullet"/>
-      </w:pPr>
-      <w:r>
-        <w:t>触发信号：突破上轨但量能不足-弱；连续2日站上上轨</w:t>
-      </w:r>
-    </w:p>
-    <w:p>
-      <w:pPr>
-        <w:pStyle w:val="ListBullet"/>
-      </w:pPr>
-      <w:r>
-        <w:t>技术面解读：股价突破布林线上轨，但成交量确认不足，可能是假突破，需要下一交易日确认。</w:t>
-      </w:r>
-    </w:p>
-    <w:p>
-      <w:pPr>
-        <w:pStyle w:val="ListBullet"/>
-      </w:pPr>
-      <w:r>
-        <w:t>是否需要下一交易日确认：是。重点观察收盘价是否继续位于关键轨道一侧，以及成交量是否延续。</w:t>
-      </w:r>
-    </w:p>
-    <w:p>
-      <w:pPr>
-        <w:pStyle w:val="ListBullet"/>
-      </w:pPr>
-      <w:r>
-        <w:t>风险提示：突破上轨但成交量不足，存在假突破风险。</w:t>
-      </w:r>
-    </w:p>
-    <w:p>
-      <w:pPr>
-        <w:pStyle w:val="Heading3"/>
-      </w:pPr>
-      <w:r>
-        <w:t>POET - POET Technologies</w:t>
-      </w:r>
-    </w:p>
-    <w:p>
-      <w:pPr>
-        <w:pStyle w:val="ListBullet"/>
-      </w:pPr>
-      <w:r>
-        <w:t>信号等级：C 观察信号</w:t>
-      </w:r>
-    </w:p>
-    <w:p>
-      <w:pPr>
-        <w:pStyle w:val="ListBullet"/>
-      </w:pPr>
-      <w:r>
-        <w:t>最新收盘价：$7.95</w:t>
-      </w:r>
-    </w:p>
-    <w:p>
-      <w:pPr>
-        <w:pStyle w:val="ListBullet"/>
-      </w:pPr>
-      <w:r>
-        <w:t>BOLL：上轨 $9.29；中轨 $8.05；下轨 $6.81</w:t>
-      </w:r>
-    </w:p>
-    <w:p>
-      <w:pPr>
-        <w:pStyle w:val="ListBullet"/>
-      </w:pPr>
-      <w:r>
-        <w:t>Bandwidth：30.73%；历史分位：10.12%；%B：0.460</w:t>
-      </w:r>
-    </w:p>
-    <w:p>
-      <w:pPr>
-        <w:pStyle w:val="ListBullet"/>
-      </w:pPr>
-      <w:r>
-        <w:t>成交量：当日 8151400；20日均量 8807105；量比 0.93</w:t>
+        <w:t>成交量：当日 42049600；20日均量 27734015；量比 1.52</w:t>
       </w:r>
     </w:p>
     <w:p>
@@ -1549,7 +929,7 @@
         <w:pStyle w:val="Heading3"/>
       </w:pPr>
       <w:r>
-        <w:t>AVGO - Broadcom Inc.</w:t>
+        <w:t>NBIS - Nebius Group</w:t>
       </w:r>
     </w:p>
     <w:p>
@@ -1565,7 +945,7 @@
         <w:pStyle w:val="ListBullet"/>
       </w:pPr>
       <w:r>
-        <w:t>最新收盘价：$361.99</w:t>
+        <w:t>最新收盘价：$212.19</w:t>
       </w:r>
     </w:p>
     <w:p>
@@ -1573,7 +953,7 @@
         <w:pStyle w:val="ListBullet"/>
       </w:pPr>
       <w:r>
-        <w:t>BOLL：上轨 $388.06；中轨 $367.49；下轨 $346.93</w:t>
+        <w:t>BOLL：上轨 $255.54；中轨 $222.55；下轨 $189.55</w:t>
       </w:r>
     </w:p>
     <w:p>
@@ -1581,7 +961,7 @@
         <w:pStyle w:val="ListBullet"/>
       </w:pPr>
       <w:r>
-        <w:t>Bandwidth：11.19%；历史分位：27.98%；%B：0.366</w:t>
+        <w:t>Bandwidth：29.65%；历史分位：9.52%；%B：0.343</w:t>
       </w:r>
     </w:p>
     <w:p>
@@ -1589,7 +969,7 @@
         <w:pStyle w:val="ListBullet"/>
       </w:pPr>
       <w:r>
-        <w:t>成交量：当日 21166900；20日均量 25745445；量比 0.82</w:t>
+        <w:t>成交量：当日 13684600；20日均量 17293740；量比 0.79</w:t>
       </w:r>
     </w:p>
     <w:p>
@@ -1597,7 +977,7 @@
         <w:pStyle w:val="ListBullet"/>
       </w:pPr>
       <w:r>
-        <w:t>触发信号：弱收口：Bandwidth低于近8个月30%分位且最近8个交易日及以上连续下降；中轨附近窄幅震荡</w:t>
+        <w:t>触发信号：强收口：Bandwidth创近100日新低；中轨附近窄幅震荡</w:t>
       </w:r>
     </w:p>
     <w:p>
@@ -1629,7 +1009,7 @@
         <w:pStyle w:val="Heading3"/>
       </w:pPr>
       <w:r>
-        <w:t>CORZ - Core Scientific, Inc.</w:t>
+        <w:t>ASTS - AST SpaceMobile</w:t>
       </w:r>
     </w:p>
     <w:p>
@@ -1645,7 +1025,7 @@
         <w:pStyle w:val="ListBullet"/>
       </w:pPr>
       <w:r>
-        <w:t>最新收盘价：$17.94</w:t>
+        <w:t>最新收盘价：$60.00</w:t>
       </w:r>
     </w:p>
     <w:p>
@@ -1653,7 +1033,7 @@
         <w:pStyle w:val="ListBullet"/>
       </w:pPr>
       <w:r>
-        <w:t>BOLL：上轨 $20.03；中轨 $17.90；下轨 $15.77</w:t>
+        <w:t>BOLL：上轨 $69.99；中轨 $62.61；下轨 $55.22</w:t>
       </w:r>
     </w:p>
     <w:p>
@@ -1661,7 +1041,7 @@
         <w:pStyle w:val="ListBullet"/>
       </w:pPr>
       <w:r>
-        <w:t>Bandwidth：23.83%；历史分位：26.19%；%B：0.509</w:t>
+        <w:t>Bandwidth：23.60%；历史分位：4.17%；%B：0.324</w:t>
       </w:r>
     </w:p>
     <w:p>
@@ -1669,7 +1049,7 @@
         <w:pStyle w:val="ListBullet"/>
       </w:pPr>
       <w:r>
-        <w:t>成交量：当日 8982100；20日均量 11093635；量比 0.81</w:t>
+        <w:t>成交量：当日 6872600；20日均量 9397530；量比 0.73</w:t>
       </w:r>
     </w:p>
     <w:p>
@@ -1677,247 +1057,7 @@
         <w:pStyle w:val="ListBullet"/>
       </w:pPr>
       <w:r>
-        <w:t>触发信号：弱收口：Bandwidth低于近8个月30%分位且最近8个交易日及以上连续下降；中轨附近窄幅震荡；低位形态</w:t>
-      </w:r>
-    </w:p>
-    <w:p>
-      <w:pPr>
-        <w:pStyle w:val="ListBullet"/>
-      </w:pPr>
-      <w:r>
-        <w:t>技术面解读：布林带收口，说明波动率下降，股价可能处于蓄势阶段，但方向尚未确认。</w:t>
-      </w:r>
-    </w:p>
-    <w:p>
-      <w:pPr>
-        <w:pStyle w:val="ListBullet"/>
-      </w:pPr>
-      <w:r>
-        <w:t>是否需要下一交易日确认：是。重点观察收盘价是否继续位于关键轨道一侧，以及成交量是否延续。</w:t>
-      </w:r>
-    </w:p>
-    <w:p>
-      <w:pPr>
-        <w:pStyle w:val="ListBullet"/>
-      </w:pPr>
-      <w:r>
-        <w:t>风险提示：当前方向仍未完全确认，需要观察成交量和中轨支撑。</w:t>
-      </w:r>
-    </w:p>
-    <w:p>
-      <w:pPr>
-        <w:pStyle w:val="Heading3"/>
-      </w:pPr>
-      <w:r>
-        <w:t>MSFT - Microsoft Corporation</w:t>
-      </w:r>
-    </w:p>
-    <w:p>
-      <w:pPr>
-        <w:pStyle w:val="ListBullet"/>
-      </w:pPr>
-      <w:r>
-        <w:t>信号等级：C 观察信号</w:t>
-      </w:r>
-    </w:p>
-    <w:p>
-      <w:pPr>
-        <w:pStyle w:val="ListBullet"/>
-      </w:pPr>
-      <w:r>
-        <w:t>最新收盘价：$495.63</w:t>
-      </w:r>
-    </w:p>
-    <w:p>
-      <w:pPr>
-        <w:pStyle w:val="ListBullet"/>
-      </w:pPr>
-      <w:r>
-        <w:t>BOLL：上轨 $513.45；中轨 $494.43；下轨 $475.42</w:t>
-      </w:r>
-    </w:p>
-    <w:p>
-      <w:pPr>
-        <w:pStyle w:val="ListBullet"/>
-      </w:pPr>
-      <w:r>
-        <w:t>Bandwidth：7.69%；历史分位：19.64%；%B：0.531</w:t>
-      </w:r>
-    </w:p>
-    <w:p>
-      <w:pPr>
-        <w:pStyle w:val="ListBullet"/>
-      </w:pPr>
-      <w:r>
-        <w:t>成交量：当日 14510500；20日均量 20799005；量比 0.70</w:t>
-      </w:r>
-    </w:p>
-    <w:p>
-      <w:pPr>
-        <w:pStyle w:val="ListBullet"/>
-      </w:pPr>
-      <w:r>
-        <w:t>触发信号：弱收口：Bandwidth连续11天维持低于近8个月30%分位；中轨附近窄幅震荡</w:t>
-      </w:r>
-    </w:p>
-    <w:p>
-      <w:pPr>
-        <w:pStyle w:val="ListBullet"/>
-      </w:pPr>
-      <w:r>
-        <w:t>技术面解读：布林带收口，说明波动率下降，股价可能处于蓄势阶段，但方向尚未确认。</w:t>
-      </w:r>
-    </w:p>
-    <w:p>
-      <w:pPr>
-        <w:pStyle w:val="ListBullet"/>
-      </w:pPr>
-      <w:r>
-        <w:t>是否需要下一交易日确认：是。重点观察收盘价是否继续位于关键轨道一侧，以及成交量是否延续。</w:t>
-      </w:r>
-    </w:p>
-    <w:p>
-      <w:pPr>
-        <w:pStyle w:val="ListBullet"/>
-      </w:pPr>
-      <w:r>
-        <w:t>风险提示：当前方向仍未完全确认，需要观察成交量和中轨支撑。</w:t>
-      </w:r>
-    </w:p>
-    <w:p>
-      <w:pPr>
-        <w:pStyle w:val="Heading3"/>
-      </w:pPr>
-      <w:r>
-        <w:t>NVDA - NVIDIA</w:t>
-      </w:r>
-    </w:p>
-    <w:p>
-      <w:pPr>
-        <w:pStyle w:val="ListBullet"/>
-      </w:pPr>
-      <w:r>
-        <w:t>信号等级：C 观察信号</w:t>
-      </w:r>
-    </w:p>
-    <w:p>
-      <w:pPr>
-        <w:pStyle w:val="ListBullet"/>
-      </w:pPr>
-      <w:r>
-        <w:t>最新收盘价：$218.29</w:t>
-      </w:r>
-    </w:p>
-    <w:p>
-      <w:pPr>
-        <w:pStyle w:val="ListBullet"/>
-      </w:pPr>
-      <w:r>
-        <w:t>BOLL：上轨 $232.08；中轨 $220.16；下轨 $208.25</w:t>
-      </w:r>
-    </w:p>
-    <w:p>
-      <w:pPr>
-        <w:pStyle w:val="ListBullet"/>
-      </w:pPr>
-      <w:r>
-        <w:t>Bandwidth：10.82%；历史分位：20.83%；%B：0.421</w:t>
-      </w:r>
-    </w:p>
-    <w:p>
-      <w:pPr>
-        <w:pStyle w:val="ListBullet"/>
-      </w:pPr>
-      <w:r>
-        <w:t>成交量：当日 89060100；20日均量 127719035；量比 0.70</w:t>
-      </w:r>
-    </w:p>
-    <w:p>
-      <w:pPr>
-        <w:pStyle w:val="ListBullet"/>
-      </w:pPr>
-      <w:r>
-        <w:t>触发信号：弱收口：Bandwidth连续10天维持低于近8个月30%分位；中轨附近窄幅震荡</w:t>
-      </w:r>
-    </w:p>
-    <w:p>
-      <w:pPr>
-        <w:pStyle w:val="ListBullet"/>
-      </w:pPr>
-      <w:r>
-        <w:t>技术面解读：布林带收口，说明波动率下降，股价可能处于蓄势阶段，但方向尚未确认。</w:t>
-      </w:r>
-    </w:p>
-    <w:p>
-      <w:pPr>
-        <w:pStyle w:val="ListBullet"/>
-      </w:pPr>
-      <w:r>
-        <w:t>是否需要下一交易日确认：是。重点观察收盘价是否继续位于关键轨道一侧，以及成交量是否延续。</w:t>
-      </w:r>
-    </w:p>
-    <w:p>
-      <w:pPr>
-        <w:pStyle w:val="ListBullet"/>
-      </w:pPr>
-      <w:r>
-        <w:t>风险提示：当前方向仍未完全确认，需要观察成交量和中轨支撑。</w:t>
-      </w:r>
-    </w:p>
-    <w:p>
-      <w:pPr>
-        <w:pStyle w:val="Heading3"/>
-      </w:pPr>
-      <w:r>
-        <w:t>ALAB - Astera Labs</w:t>
-      </w:r>
-    </w:p>
-    <w:p>
-      <w:pPr>
-        <w:pStyle w:val="ListBullet"/>
-      </w:pPr>
-      <w:r>
-        <w:t>信号等级：C 观察信号</w:t>
-      </w:r>
-    </w:p>
-    <w:p>
-      <w:pPr>
-        <w:pStyle w:val="ListBullet"/>
-      </w:pPr>
-      <w:r>
-        <w:t>最新收盘价：$291.22</w:t>
-      </w:r>
-    </w:p>
-    <w:p>
-      <w:pPr>
-        <w:pStyle w:val="ListBullet"/>
-      </w:pPr>
-      <w:r>
-        <w:t>BOLL：上轨 $319.00；中轨 $293.16；下轨 $267.31</w:t>
-      </w:r>
-    </w:p>
-    <w:p>
-      <w:pPr>
-        <w:pStyle w:val="ListBullet"/>
-      </w:pPr>
-      <w:r>
-        <w:t>Bandwidth：17.63%；历史分位：8.93%；%B：0.463</w:t>
-      </w:r>
-    </w:p>
-    <w:p>
-      <w:pPr>
-        <w:pStyle w:val="ListBullet"/>
-      </w:pPr>
-      <w:r>
-        <w:t>成交量：当日 2312000；20日均量 3417145；量比 0.68</w:t>
-      </w:r>
-    </w:p>
-    <w:p>
-      <w:pPr>
-        <w:pStyle w:val="ListBullet"/>
-      </w:pPr>
-      <w:r>
-        <w:t>触发信号：强收口：Bandwidth创近100日新低；中轨附近窄幅震荡</w:t>
+        <w:t>触发信号：强收口：Bandwidth创近100日新低；中轨附近窄幅震荡；低位形态</w:t>
       </w:r>
     </w:p>
     <w:p>
@@ -1967,7 +1107,7 @@
     </w:p>
     <w:p>
       <w:r>
-        <w:t>XE（X-energy）, RKLB（Rocket Lab USA）, NBIS（Nebius Group）, ARM（Arm Holdings）, OPTX（Syntec Optics Holdings）, GLW（Corning）, COHR（Coherent）, LITE（Lumentum Holdings）, MRVL（Marvell Technology）, INTC（Intel）, FLNC（Fluence Energy）, CRWV（CoreWeave）, ORCL（Oracle）, NVTS（Navitas Semiconductor）, BB（BlackBerry）, ONDS（Ondas Holdings）, SMR（NuScale Power）, OKLO（Oklo）, IONQ（IonQ）, QBTS（D-Wave Quantum）, AMZN（Amazon.com）, AMD（Advanced Micro Devices）, CRCL（Circle Internet Group）, FLY（Firefly Aerospace）, CBRS（Chain Bridge Bancorp）, CIEN（Ciena）, SIVEF（Sivers Semiconductors）, SHAZ（Shaz）, LUNR（Intuitive Machines）, ASTS（AST SpaceMobile）, AAOI（Applied Optoelectronics）, INOD（Innodata）, SPCX（Space Exploration Technologies）, RDW（Redwire Corporation）, COIN（Coinbase Global, Inc.）, IREN（IREN LIMITED）, VELO（Velo3D, Inc.）, GOOG（Alphabet Inc.）, AMAT（Applied Materials, Inc.）, AMKR（Amkor Technology, Inc.）, LRCX（Lam Research Corporation）, SNDK（Sandisk Corporation）, MU（Micron Technology, Inc.）, VICR（Vicor Corporation）, NNE（Nano Nuclear Energy Inc.）, CCJ（Cameco Corporation）, BWAY（Brainsway Ltd.）, MANE（Veradermics, Incorporated）, QSI（Quantum-Si Incorporated）, CRSP（CRISPR Therapeutics AG）, IBRX（ImmunityBio, Inc.）</w:t>
+        <w:t>NOK（Nokia Oyj）, XE（X-energy）, RKLB（Rocket Lab USA）, ARM（Arm Holdings）, OPTX（Syntec Optics Holdings）, GLW（Corning）, COHR（Coherent）, LITE（Lumentum Holdings）, MRVL（Marvell Technology）, INTC（Intel）, ALAB（Astera Labs）, FLNC（Fluence Energy）, CRWV（CoreWeave）, NVTS（Navitas Semiconductor）, POET（POET Technologies）, DELL（Dell Technologies）, BB（BlackBerry）, ONDS（Ondas Holdings）, SMR（NuScale Power）, OKLO（Oklo）, IONQ（IonQ）, QBTS（D-Wave Quantum）, NVDA（NVIDIA）, AMZN（Amazon.com）, AMD（Advanced Micro Devices）, CRCL（Circle Internet Group）, FLY（Firefly Aerospace）, CBRS（Chain Bridge Bancorp）, CIEN（Ciena）, SIVEF（Sivers Semiconductors）, SHAZ（Shaz）, LUNR（Intuitive Machines）, AAOI（Applied Optoelectronics）, INOD（Innodata）, SPCX（Space Exploration Technologies）, RDW（Redwire Corporation）, QCOM（QUALCOMM Incorporated）, COIN（Coinbase Global, Inc.）, CORZ（Core Scientific, Inc.）, IREN（IREN LIMITED）, VELO（Velo3D, Inc.）, MSFT（Microsoft Corporation）, AVGO（Broadcom Inc.）, AMAT（Applied Materials, Inc.）, AMKR（Amkor Technology, Inc.）, LRCX（Lam Research Corporation）, SNDK（Sandisk Corporation）, MU（Micron Technology, Inc.）, VICR（Vicor Corporation）, NNE（Nano Nuclear Energy Inc.）, CCJ（Cameco Corporation）, BWAY（Brainsway Ltd.）, MANE（Veradermics, Incorporated）, QSI（Quantum-Si Incorporated）, CRSP（CRISPR Therapeutics AG）, IBRX（ImmunityBio, Inc.）</w:t>
       </w:r>
     </w:p>
     <w:p>
@@ -2032,7 +1172,7 @@
         <w:pStyle w:val="Heading3"/>
       </w:pPr>
       <w:r>
-        <w:t>DELL - Dell Technologies</w:t>
+        <w:t>GOOG - Alphabet Inc.</w:t>
       </w:r>
     </w:p>
     <w:p>
@@ -2048,7 +1188,7 @@
               <a:graphicData uri="http://schemas.openxmlformats.org/drawingml/2006/picture">
                 <pic:pic>
                   <pic:nvPicPr>
-                    <pic:cNvPr id="0" name="DELL_BOLL.png"/>
+                    <pic:cNvPr id="0" name="GOOG_BOLL.png"/>
                     <pic:cNvPicPr/>
                   </pic:nvPicPr>
                   <pic:blipFill>
@@ -2076,7 +1216,7 @@
         <w:pStyle w:val="Heading3"/>
       </w:pPr>
       <w:r>
-        <w:t>NOK - Nokia Oyj</w:t>
+        <w:t>ORCL - Oracle</w:t>
       </w:r>
     </w:p>
     <w:p>
@@ -2092,7 +1232,7 @@
               <a:graphicData uri="http://schemas.openxmlformats.org/drawingml/2006/picture">
                 <pic:pic>
                   <pic:nvPicPr>
-                    <pic:cNvPr id="0" name="NOK_BOLL.png"/>
+                    <pic:cNvPr id="0" name="ORCL_BOLL.png"/>
                     <pic:cNvPicPr/>
                   </pic:nvPicPr>
                   <pic:blipFill>
@@ -2120,7 +1260,7 @@
         <w:pStyle w:val="Heading3"/>
       </w:pPr>
       <w:r>
-        <w:t>QCOM - QUALCOMM Incorporated</w:t>
+        <w:t>NBIS - Nebius Group</w:t>
       </w:r>
     </w:p>
     <w:p>
@@ -2136,7 +1276,7 @@
               <a:graphicData uri="http://schemas.openxmlformats.org/drawingml/2006/picture">
                 <pic:pic>
                   <pic:nvPicPr>
-                    <pic:cNvPr id="0" name="QCOM_BOLL.png"/>
+                    <pic:cNvPr id="0" name="NBIS_BOLL.png"/>
                     <pic:cNvPicPr/>
                   </pic:nvPicPr>
                   <pic:blipFill>
@@ -2164,7 +1304,7 @@
         <w:pStyle w:val="Heading3"/>
       </w:pPr>
       <w:r>
-        <w:t>POET - POET Technologies</w:t>
+        <w:t>ASTS - AST SpaceMobile</w:t>
       </w:r>
     </w:p>
     <w:p>
@@ -2180,231 +1320,11 @@
               <a:graphicData uri="http://schemas.openxmlformats.org/drawingml/2006/picture">
                 <pic:pic>
                   <pic:nvPicPr>
-                    <pic:cNvPr id="0" name="POET_BOLL.png"/>
+                    <pic:cNvPr id="0" name="ASTS_BOLL.png"/>
                     <pic:cNvPicPr/>
                   </pic:nvPicPr>
                   <pic:blipFill>
                     <a:blip r:embed="rId13"/>
-                    <a:stretch>
-                      <a:fillRect/>
-                    </a:stretch>
-                  </pic:blipFill>
-                  <pic:spPr>
-                    <a:xfrm>
-                      <a:off x="0" y="0"/>
-                      <a:ext cx="6035040" cy="4054793"/>
-                    </a:xfrm>
-                    <a:prstGeom prst="rect"/>
-                  </pic:spPr>
-                </pic:pic>
-              </a:graphicData>
-            </a:graphic>
-          </wp:inline>
-        </w:drawing>
-      </w:r>
-    </w:p>
-    <w:p>
-      <w:pPr>
-        <w:pStyle w:val="Heading3"/>
-      </w:pPr>
-      <w:r>
-        <w:t>AVGO - Broadcom Inc.</w:t>
-      </w:r>
-    </w:p>
-    <w:p>
-      <w:r>
-        <w:drawing>
-          <wp:inline xmlns:a="http://schemas.openxmlformats.org/drawingml/2006/main" xmlns:pic="http://schemas.openxmlformats.org/drawingml/2006/picture">
-            <wp:extent cx="6035040" cy="4054793"/>
-            <wp:docPr id="6" name="Picture 6"/>
-            <wp:cNvGraphicFramePr>
-              <a:graphicFrameLocks noChangeAspect="1"/>
-            </wp:cNvGraphicFramePr>
-            <a:graphic>
-              <a:graphicData uri="http://schemas.openxmlformats.org/drawingml/2006/picture">
-                <pic:pic>
-                  <pic:nvPicPr>
-                    <pic:cNvPr id="0" name="AVGO_BOLL.png"/>
-                    <pic:cNvPicPr/>
-                  </pic:nvPicPr>
-                  <pic:blipFill>
-                    <a:blip r:embed="rId14"/>
-                    <a:stretch>
-                      <a:fillRect/>
-                    </a:stretch>
-                  </pic:blipFill>
-                  <pic:spPr>
-                    <a:xfrm>
-                      <a:off x="0" y="0"/>
-                      <a:ext cx="6035040" cy="4054793"/>
-                    </a:xfrm>
-                    <a:prstGeom prst="rect"/>
-                  </pic:spPr>
-                </pic:pic>
-              </a:graphicData>
-            </a:graphic>
-          </wp:inline>
-        </w:drawing>
-      </w:r>
-    </w:p>
-    <w:p>
-      <w:pPr>
-        <w:pStyle w:val="Heading3"/>
-      </w:pPr>
-      <w:r>
-        <w:t>CORZ - Core Scientific, Inc.</w:t>
-      </w:r>
-    </w:p>
-    <w:p>
-      <w:r>
-        <w:drawing>
-          <wp:inline xmlns:a="http://schemas.openxmlformats.org/drawingml/2006/main" xmlns:pic="http://schemas.openxmlformats.org/drawingml/2006/picture">
-            <wp:extent cx="6035040" cy="4054793"/>
-            <wp:docPr id="7" name="Picture 7"/>
-            <wp:cNvGraphicFramePr>
-              <a:graphicFrameLocks noChangeAspect="1"/>
-            </wp:cNvGraphicFramePr>
-            <a:graphic>
-              <a:graphicData uri="http://schemas.openxmlformats.org/drawingml/2006/picture">
-                <pic:pic>
-                  <pic:nvPicPr>
-                    <pic:cNvPr id="0" name="CORZ_BOLL.png"/>
-                    <pic:cNvPicPr/>
-                  </pic:nvPicPr>
-                  <pic:blipFill>
-                    <a:blip r:embed="rId15"/>
-                    <a:stretch>
-                      <a:fillRect/>
-                    </a:stretch>
-                  </pic:blipFill>
-                  <pic:spPr>
-                    <a:xfrm>
-                      <a:off x="0" y="0"/>
-                      <a:ext cx="6035040" cy="4054793"/>
-                    </a:xfrm>
-                    <a:prstGeom prst="rect"/>
-                  </pic:spPr>
-                </pic:pic>
-              </a:graphicData>
-            </a:graphic>
-          </wp:inline>
-        </w:drawing>
-      </w:r>
-    </w:p>
-    <w:p>
-      <w:pPr>
-        <w:pStyle w:val="Heading3"/>
-      </w:pPr>
-      <w:r>
-        <w:t>MSFT - Microsoft Corporation</w:t>
-      </w:r>
-    </w:p>
-    <w:p>
-      <w:r>
-        <w:drawing>
-          <wp:inline xmlns:a="http://schemas.openxmlformats.org/drawingml/2006/main" xmlns:pic="http://schemas.openxmlformats.org/drawingml/2006/picture">
-            <wp:extent cx="6035040" cy="4054793"/>
-            <wp:docPr id="8" name="Picture 8"/>
-            <wp:cNvGraphicFramePr>
-              <a:graphicFrameLocks noChangeAspect="1"/>
-            </wp:cNvGraphicFramePr>
-            <a:graphic>
-              <a:graphicData uri="http://schemas.openxmlformats.org/drawingml/2006/picture">
-                <pic:pic>
-                  <pic:nvPicPr>
-                    <pic:cNvPr id="0" name="MSFT_BOLL.png"/>
-                    <pic:cNvPicPr/>
-                  </pic:nvPicPr>
-                  <pic:blipFill>
-                    <a:blip r:embed="rId16"/>
-                    <a:stretch>
-                      <a:fillRect/>
-                    </a:stretch>
-                  </pic:blipFill>
-                  <pic:spPr>
-                    <a:xfrm>
-                      <a:off x="0" y="0"/>
-                      <a:ext cx="6035040" cy="4054793"/>
-                    </a:xfrm>
-                    <a:prstGeom prst="rect"/>
-                  </pic:spPr>
-                </pic:pic>
-              </a:graphicData>
-            </a:graphic>
-          </wp:inline>
-        </w:drawing>
-      </w:r>
-    </w:p>
-    <w:p>
-      <w:pPr>
-        <w:pStyle w:val="Heading3"/>
-      </w:pPr>
-      <w:r>
-        <w:t>NVDA - NVIDIA</w:t>
-      </w:r>
-    </w:p>
-    <w:p>
-      <w:r>
-        <w:drawing>
-          <wp:inline xmlns:a="http://schemas.openxmlformats.org/drawingml/2006/main" xmlns:pic="http://schemas.openxmlformats.org/drawingml/2006/picture">
-            <wp:extent cx="6035040" cy="4054793"/>
-            <wp:docPr id="9" name="Picture 9"/>
-            <wp:cNvGraphicFramePr>
-              <a:graphicFrameLocks noChangeAspect="1"/>
-            </wp:cNvGraphicFramePr>
-            <a:graphic>
-              <a:graphicData uri="http://schemas.openxmlformats.org/drawingml/2006/picture">
-                <pic:pic>
-                  <pic:nvPicPr>
-                    <pic:cNvPr id="0" name="NVDA_BOLL.png"/>
-                    <pic:cNvPicPr/>
-                  </pic:nvPicPr>
-                  <pic:blipFill>
-                    <a:blip r:embed="rId17"/>
-                    <a:stretch>
-                      <a:fillRect/>
-                    </a:stretch>
-                  </pic:blipFill>
-                  <pic:spPr>
-                    <a:xfrm>
-                      <a:off x="0" y="0"/>
-                      <a:ext cx="6035040" cy="4054793"/>
-                    </a:xfrm>
-                    <a:prstGeom prst="rect"/>
-                  </pic:spPr>
-                </pic:pic>
-              </a:graphicData>
-            </a:graphic>
-          </wp:inline>
-        </w:drawing>
-      </w:r>
-    </w:p>
-    <w:p>
-      <w:pPr>
-        <w:pStyle w:val="Heading3"/>
-      </w:pPr>
-      <w:r>
-        <w:t>ALAB - Astera Labs</w:t>
-      </w:r>
-    </w:p>
-    <w:p>
-      <w:r>
-        <w:drawing>
-          <wp:inline xmlns:a="http://schemas.openxmlformats.org/drawingml/2006/main" xmlns:pic="http://schemas.openxmlformats.org/drawingml/2006/picture">
-            <wp:extent cx="6035040" cy="4054793"/>
-            <wp:docPr id="10" name="Picture 10"/>
-            <wp:cNvGraphicFramePr>
-              <a:graphicFrameLocks noChangeAspect="1"/>
-            </wp:cNvGraphicFramePr>
-            <a:graphic>
-              <a:graphicData uri="http://schemas.openxmlformats.org/drawingml/2006/picture">
-                <pic:pic>
-                  <pic:nvPicPr>
-                    <pic:cNvPr id="0" name="ALAB_BOLL.png"/>
-                    <pic:cNvPicPr/>
-                  </pic:nvPicPr>
-                  <pic:blipFill>
-                    <a:blip r:embed="rId18"/>
                     <a:stretch>
                       <a:fillRect/>
                     </a:stretch>

</xml_diff>